<commit_message>
Updated the changes in documentation. The changes included test cases of website's network protocol and sitemap.
</commit_message>
<xml_diff>
--- a/Complete Apple Website Software Testing/APPLE WEBSITE AUTOMATION TESTING Software Testing Documentation.docx
+++ b/Complete Apple Website Software Testing/APPLE WEBSITE AUTOMATION TESTING Software Testing Documentation.docx
@@ -661,10 +661,7 @@
         <w:spacing w:line="240" w:lineRule="auto"/>
       </w:pPr>
       <w:r>
-        <w:t xml:space="preserve">2.4 Item Pass </w:t>
-      </w:r>
-      <w:r>
-        <w:t>/ Fail Criteria</w:t>
+        <w:t>2.4 Item Pass / Fail Criteria</w:t>
       </w:r>
     </w:p>
     <w:p>
@@ -1025,10 +1022,7 @@
         <w:spacing w:before="240" w:after="240" w:line="240" w:lineRule="auto"/>
       </w:pPr>
       <w:r>
-        <w:t>The purpose of this project is to automate functional testing of the Apple website using Selenium WebDriver. The auto</w:t>
-      </w:r>
-      <w:r>
-        <w:t>mation script validates important website functionalities such as:</w:t>
+        <w:t>The purpose of this project is to automate functional testing of the Apple website using Selenium WebDriver. The automation script validates important website functionalities such as:</w:t>
       </w:r>
     </w:p>
     <w:p>
@@ -1115,10 +1109,7 @@
         <w:spacing w:before="240" w:after="240" w:line="240" w:lineRule="auto"/>
       </w:pPr>
       <w:r>
-        <w:t>This document provides detailed test scenari</w:t>
-      </w:r>
-      <w:r>
-        <w:t>os and expected outcomes.</w:t>
+        <w:t>This document provides detailed test scenarios and expected outcomes.</w:t>
       </w:r>
     </w:p>
     <w:p>
@@ -1210,10 +1201,7 @@
         <w:spacing w:line="240" w:lineRule="auto"/>
       </w:pPr>
       <w:r>
-        <w:t>Search func</w:t>
-      </w:r>
-      <w:r>
-        <w:t>tionality</w:t>
+        <w:t>Search functionality</w:t>
       </w:r>
     </w:p>
     <w:p>
@@ -1253,6 +1241,32 @@
       </w:pPr>
       <w:r>
         <w:t>Scrolling operations</w:t>
+      </w:r>
+    </w:p>
+    <w:p>
+      <w:pPr>
+        <w:keepLines/>
+        <w:numPr>
+          <w:ilvl w:val="0"/>
+          <w:numId w:val="22"/>
+        </w:numPr>
+        <w:spacing w:line="240" w:lineRule="auto"/>
+      </w:pPr>
+      <w:r>
+        <w:t>Apple Sitemap</w:t>
+      </w:r>
+    </w:p>
+    <w:p>
+      <w:pPr>
+        <w:keepLines/>
+        <w:numPr>
+          <w:ilvl w:val="0"/>
+          <w:numId w:val="22"/>
+        </w:numPr>
+        <w:spacing w:line="240" w:lineRule="auto"/>
+      </w:pPr>
+      <w:r>
+        <w:t>Testing whether the site enforces HTTPS network protocol over HTTP</w:t>
       </w:r>
     </w:p>
     <w:p>
@@ -1374,6 +1388,7 @@
         <w:spacing w:line="240" w:lineRule="auto"/>
       </w:pPr>
       <w:r>
+        <w:lastRenderedPageBreak/>
         <w:pict w14:anchorId="494732DB">
           <v:rect id="_x0000_i1026" style="width:0;height:1.5pt" o:hralign="center" o:hrstd="t" o:hr="t" fillcolor="#a0a0a0" stroked="f"/>
         </w:pict>
@@ -1400,7 +1415,6 @@
           <w:sz w:val="34"/>
           <w:szCs w:val="34"/>
         </w:rPr>
-        <w:lastRenderedPageBreak/>
         <w:t>1.3 References</w:t>
       </w:r>
     </w:p>
@@ -1663,10 +1677,7 @@
         <w:spacing w:before="240" w:after="240" w:line="240" w:lineRule="auto"/>
       </w:pPr>
       <w:r>
-        <w:t>The complete automation workflow is executed to verify that the complete system behaves a</w:t>
-      </w:r>
-      <w:r>
-        <w:t>ccording to requirements.</w:t>
+        <w:t>The complete automation workflow is executed to verify that the complete system behaves according to requirements.</w:t>
       </w:r>
     </w:p>
     <w:p>
@@ -1744,6 +1755,7 @@
         <w:spacing w:before="240" w:after="240" w:line="240" w:lineRule="auto"/>
       </w:pPr>
       <w:r>
+        <w:lastRenderedPageBreak/>
         <w:t>The following test classes are included:</w:t>
       </w:r>
     </w:p>
@@ -2288,6 +2300,19 @@
         <w:spacing w:line="240" w:lineRule="auto"/>
       </w:pPr>
       <w:r>
+        <w:t>Options available in sitemap</w:t>
+      </w:r>
+    </w:p>
+    <w:p>
+      <w:pPr>
+        <w:keepLines/>
+        <w:numPr>
+          <w:ilvl w:val="0"/>
+          <w:numId w:val="21"/>
+        </w:numPr>
+        <w:spacing w:line="240" w:lineRule="auto"/>
+      </w:pPr>
+      <w:r>
         <w:t>Page scrolling</w:t>
       </w:r>
     </w:p>
@@ -2443,6 +2468,7 @@
         <w:spacing w:after="240" w:line="240" w:lineRule="auto"/>
       </w:pPr>
       <w:r>
+        <w:lastRenderedPageBreak/>
         <w:t>Security penetration testing</w:t>
       </w:r>
     </w:p>
@@ -2478,7 +2504,6 @@
           <w:sz w:val="34"/>
           <w:szCs w:val="34"/>
         </w:rPr>
-        <w:lastRenderedPageBreak/>
         <w:t>2.3 Testing Approach</w:t>
       </w:r>
     </w:p>
@@ -2622,16 +2647,7 @@
           <w:sz w:val="34"/>
           <w:szCs w:val="34"/>
         </w:rPr>
-        <w:t>2.4 Item</w:t>
-      </w:r>
-      <w:r>
-        <w:rPr>
-          <w:b/>
-          <w:bCs/>
-          <w:sz w:val="34"/>
-          <w:szCs w:val="34"/>
-        </w:rPr>
-        <w:t xml:space="preserve"> Pass / Fail Criteria</w:t>
+        <w:t>2.4 Item Pass / Fail Criteria</w:t>
       </w:r>
     </w:p>
     <w:p>
@@ -2836,6 +2852,7 @@
           <w:sz w:val="34"/>
           <w:szCs w:val="34"/>
         </w:rPr>
+        <w:lastRenderedPageBreak/>
         <w:t>2.5 Test Deliverables</w:t>
       </w:r>
     </w:p>
@@ -2858,7 +2875,6 @@
         <w:spacing w:before="240" w:line="240" w:lineRule="auto"/>
       </w:pPr>
       <w:r>
-        <w:lastRenderedPageBreak/>
         <w:t>Selenium automation script</w:t>
       </w:r>
     </w:p>
@@ -3232,6 +3248,7 @@
         <w:spacing w:before="240" w:after="240" w:line="240" w:lineRule="auto"/>
       </w:pPr>
       <w:r>
+        <w:lastRenderedPageBreak/>
         <w:t>Libraries:</w:t>
       </w:r>
     </w:p>
@@ -3259,7 +3276,6 @@
         <w:spacing w:line="240" w:lineRule="auto"/>
       </w:pPr>
       <w:r>
-        <w:lastRenderedPageBreak/>
         <w:t>time</w:t>
       </w:r>
     </w:p>
@@ -3994,6 +4010,7 @@
               <w:spacing w:line="240" w:lineRule="auto"/>
             </w:pPr>
             <w:r>
+              <w:lastRenderedPageBreak/>
               <w:t>TC02</w:t>
             </w:r>
           </w:p>
@@ -4022,11 +4039,7 @@
               <w:spacing w:line="240" w:lineRule="auto"/>
             </w:pPr>
             <w:r>
-              <w:t xml:space="preserve">Verify country/location popup </w:t>
-            </w:r>
-            <w:r>
-              <w:lastRenderedPageBreak/>
-              <w:t>handling (if any)</w:t>
+              <w:t>Verify country/location popup handling (if any)</w:t>
             </w:r>
           </w:p>
         </w:tc>
@@ -4054,7 +4067,6 @@
               <w:spacing w:line="240" w:lineRule="auto"/>
             </w:pPr>
             <w:r>
-              <w:lastRenderedPageBreak/>
               <w:t>none</w:t>
             </w:r>
           </w:p>
@@ -4083,11 +4095,7 @@
               <w:spacing w:line="240" w:lineRule="auto"/>
             </w:pPr>
             <w:r>
-              <w:t xml:space="preserve">If popup appears, it should close </w:t>
-            </w:r>
-            <w:r>
-              <w:lastRenderedPageBreak/>
-              <w:t xml:space="preserve">automatically. </w:t>
+              <w:t xml:space="preserve">If popup appears, it should close automatically. </w:t>
             </w:r>
           </w:p>
         </w:tc>
@@ -4108,12 +4116,7 @@
               <w:spacing w:line="240" w:lineRule="auto"/>
             </w:pPr>
             <w:r>
-              <w:lastRenderedPageBreak/>
-              <w:t>Chrome Brows</w:t>
-            </w:r>
-            <w:r>
-              <w:lastRenderedPageBreak/>
-              <w:t>er, Selenium WebDriver</w:t>
+              <w:t>Chrome Browser, Selenium WebDriver</w:t>
             </w:r>
           </w:p>
         </w:tc>
@@ -4141,7 +4144,6 @@
               <w:spacing w:line="240" w:lineRule="auto"/>
             </w:pPr>
             <w:r>
-              <w:lastRenderedPageBreak/>
               <w:t>TC01</w:t>
             </w:r>
           </w:p>
@@ -4193,7 +4195,6 @@
               <w:spacing w:line="240" w:lineRule="auto"/>
             </w:pPr>
             <w:r>
-              <w:lastRenderedPageBreak/>
               <w:t>TC03</w:t>
             </w:r>
           </w:p>
@@ -4824,7 +4825,11 @@
               <w:spacing w:line="240" w:lineRule="auto"/>
             </w:pPr>
             <w:r>
-              <w:t>MacBook</w:t>
+              <w:t>MacBoo</w:t>
+            </w:r>
+            <w:r>
+              <w:lastRenderedPageBreak/>
+              <w:t>k</w:t>
             </w:r>
           </w:p>
           <w:p>
@@ -4850,11 +4855,7 @@
               <w:spacing w:line="240" w:lineRule="auto"/>
             </w:pPr>
             <w:r>
-              <w:t xml:space="preserve">Apple </w:t>
-            </w:r>
-            <w:r>
-              <w:lastRenderedPageBreak/>
-              <w:t>Watch</w:t>
+              <w:t>Apple Watch</w:t>
             </w:r>
           </w:p>
           <w:p>
@@ -4911,7 +4912,11 @@
             </w:pPr>
             <w:r>
               <w:lastRenderedPageBreak/>
-              <w:t xml:space="preserve">Search results page should appear and the script must search for each of the mentioned products. </w:t>
+              <w:t xml:space="preserve">Search results page should appear and the script must search for each </w:t>
+            </w:r>
+            <w:r>
+              <w:lastRenderedPageBreak/>
+              <w:t xml:space="preserve">of the mentioned products. </w:t>
             </w:r>
           </w:p>
           <w:p>
@@ -5464,6 +5469,490 @@
           </w:p>
         </w:tc>
       </w:tr>
+      <w:tr>
+        <w:tc>
+          <w:tcPr>
+            <w:tcW w:w="1125" w:type="dxa"/>
+            <w:shd w:val="clear" w:color="auto" w:fill="auto"/>
+            <w:tcMar>
+              <w:top w:w="100" w:type="dxa"/>
+              <w:left w:w="100" w:type="dxa"/>
+              <w:bottom w:w="100" w:type="dxa"/>
+              <w:right w:w="100" w:type="dxa"/>
+            </w:tcMar>
+          </w:tcPr>
+          <w:p>
+            <w:pPr>
+              <w:widowControl w:val="0"/>
+              <w:spacing w:line="240" w:lineRule="auto"/>
+            </w:pPr>
+            <w:r>
+              <w:t>TC08</w:t>
+            </w:r>
+          </w:p>
+        </w:tc>
+        <w:tc>
+          <w:tcPr>
+            <w:tcW w:w="1620" w:type="dxa"/>
+            <w:shd w:val="clear" w:color="auto" w:fill="auto"/>
+            <w:tcMar>
+              <w:top w:w="100" w:type="dxa"/>
+              <w:left w:w="100" w:type="dxa"/>
+              <w:bottom w:w="100" w:type="dxa"/>
+              <w:right w:w="100" w:type="dxa"/>
+            </w:tcMar>
+          </w:tcPr>
+          <w:p>
+            <w:pPr>
+              <w:widowControl w:val="0"/>
+              <w:pBdr>
+                <w:top w:val="nil"/>
+                <w:left w:val="nil"/>
+                <w:bottom w:val="nil"/>
+                <w:right w:val="nil"/>
+                <w:between w:val="nil"/>
+              </w:pBdr>
+              <w:spacing w:line="240" w:lineRule="auto"/>
+            </w:pPr>
+            <w:r>
+              <w:t>Apple’s sitemap</w:t>
+            </w:r>
+          </w:p>
+        </w:tc>
+        <w:tc>
+          <w:tcPr>
+            <w:tcW w:w="1755" w:type="dxa"/>
+            <w:shd w:val="clear" w:color="auto" w:fill="auto"/>
+            <w:tcMar>
+              <w:top w:w="100" w:type="dxa"/>
+              <w:left w:w="100" w:type="dxa"/>
+              <w:bottom w:w="100" w:type="dxa"/>
+              <w:right w:w="100" w:type="dxa"/>
+            </w:tcMar>
+          </w:tcPr>
+          <w:p>
+            <w:pPr>
+              <w:widowControl w:val="0"/>
+              <w:pBdr>
+                <w:top w:val="nil"/>
+                <w:left w:val="nil"/>
+                <w:bottom w:val="nil"/>
+                <w:right w:val="nil"/>
+                <w:between w:val="nil"/>
+              </w:pBdr>
+              <w:spacing w:line="240" w:lineRule="auto"/>
+            </w:pPr>
+            <w:r>
+              <w:t>None</w:t>
+            </w:r>
+          </w:p>
+        </w:tc>
+        <w:tc>
+          <w:tcPr>
+            <w:tcW w:w="1770" w:type="dxa"/>
+            <w:shd w:val="clear" w:color="auto" w:fill="auto"/>
+            <w:tcMar>
+              <w:top w:w="100" w:type="dxa"/>
+              <w:left w:w="100" w:type="dxa"/>
+              <w:bottom w:w="100" w:type="dxa"/>
+              <w:right w:w="100" w:type="dxa"/>
+            </w:tcMar>
+          </w:tcPr>
+          <w:p>
+            <w:pPr>
+              <w:pStyle w:val="ListParagraph"/>
+              <w:widowControl w:val="0"/>
+              <w:numPr>
+                <w:ilvl w:val="0"/>
+                <w:numId w:val="24"/>
+              </w:numPr>
+              <w:spacing w:before="240" w:after="240" w:line="240" w:lineRule="auto"/>
+            </w:pPr>
+            <w:r>
+              <w:t>About Apple</w:t>
+            </w:r>
+          </w:p>
+          <w:p>
+            <w:pPr>
+              <w:pStyle w:val="ListParagraph"/>
+              <w:widowControl w:val="0"/>
+              <w:numPr>
+                <w:ilvl w:val="0"/>
+                <w:numId w:val="24"/>
+              </w:numPr>
+              <w:spacing w:before="240" w:after="240" w:line="240" w:lineRule="auto"/>
+            </w:pPr>
+            <w:r>
+              <w:t>Apple Values</w:t>
+            </w:r>
+          </w:p>
+          <w:p>
+            <w:pPr>
+              <w:pStyle w:val="ListParagraph"/>
+              <w:widowControl w:val="0"/>
+              <w:numPr>
+                <w:ilvl w:val="0"/>
+                <w:numId w:val="24"/>
+              </w:numPr>
+              <w:spacing w:before="240" w:after="240" w:line="240" w:lineRule="auto"/>
+            </w:pPr>
+            <w:r>
+              <w:t>Where to Buy</w:t>
+            </w:r>
+          </w:p>
+          <w:p>
+            <w:pPr>
+              <w:pStyle w:val="ListParagraph"/>
+              <w:widowControl w:val="0"/>
+              <w:numPr>
+                <w:ilvl w:val="0"/>
+                <w:numId w:val="24"/>
+              </w:numPr>
+              <w:spacing w:before="240" w:after="240" w:line="240" w:lineRule="auto"/>
+            </w:pPr>
+            <w:r>
+              <w:t>Store Services</w:t>
+            </w:r>
+          </w:p>
+          <w:p>
+            <w:pPr>
+              <w:pStyle w:val="ListParagraph"/>
+              <w:widowControl w:val="0"/>
+              <w:numPr>
+                <w:ilvl w:val="0"/>
+                <w:numId w:val="24"/>
+              </w:numPr>
+              <w:spacing w:before="240" w:after="240" w:line="240" w:lineRule="auto"/>
+            </w:pPr>
+            <w:r>
+              <w:t>Account</w:t>
+            </w:r>
+          </w:p>
+          <w:p>
+            <w:pPr>
+              <w:pStyle w:val="ListParagraph"/>
+              <w:widowControl w:val="0"/>
+              <w:numPr>
+                <w:ilvl w:val="0"/>
+                <w:numId w:val="24"/>
+              </w:numPr>
+              <w:spacing w:before="240" w:after="240" w:line="240" w:lineRule="auto"/>
+            </w:pPr>
+            <w:r>
+              <w:t>For Education</w:t>
+            </w:r>
+          </w:p>
+          <w:p>
+            <w:pPr>
+              <w:pStyle w:val="ListParagraph"/>
+              <w:widowControl w:val="0"/>
+              <w:numPr>
+                <w:ilvl w:val="0"/>
+                <w:numId w:val="24"/>
+              </w:numPr>
+              <w:spacing w:before="240" w:after="240" w:line="240" w:lineRule="auto"/>
+            </w:pPr>
+            <w:r>
+              <w:t>For Business</w:t>
+            </w:r>
+          </w:p>
+          <w:p>
+            <w:pPr>
+              <w:pStyle w:val="ListParagraph"/>
+              <w:widowControl w:val="0"/>
+              <w:numPr>
+                <w:ilvl w:val="0"/>
+                <w:numId w:val="24"/>
+              </w:numPr>
+              <w:spacing w:before="240" w:after="240" w:line="240" w:lineRule="auto"/>
+            </w:pPr>
+            <w:r>
+              <w:t>News and Events</w:t>
+            </w:r>
+          </w:p>
+          <w:p>
+            <w:pPr>
+              <w:pStyle w:val="ListParagraph"/>
+              <w:widowControl w:val="0"/>
+              <w:numPr>
+                <w:ilvl w:val="0"/>
+                <w:numId w:val="24"/>
+              </w:numPr>
+              <w:spacing w:before="240" w:after="240" w:line="240" w:lineRule="auto"/>
+            </w:pPr>
+            <w:r>
+              <w:t>More Product-</w:t>
+            </w:r>
+            <w:r>
+              <w:lastRenderedPageBreak/>
+              <w:t>wise options</w:t>
+            </w:r>
+          </w:p>
+        </w:tc>
+        <w:tc>
+          <w:tcPr>
+            <w:tcW w:w="825" w:type="dxa"/>
+            <w:shd w:val="clear" w:color="auto" w:fill="auto"/>
+            <w:tcMar>
+              <w:top w:w="100" w:type="dxa"/>
+              <w:left w:w="100" w:type="dxa"/>
+              <w:bottom w:w="100" w:type="dxa"/>
+              <w:right w:w="100" w:type="dxa"/>
+            </w:tcMar>
+          </w:tcPr>
+          <w:p>
+            <w:pPr>
+              <w:widowControl w:val="0"/>
+              <w:pBdr>
+                <w:top w:val="nil"/>
+                <w:left w:val="nil"/>
+                <w:bottom w:val="nil"/>
+                <w:right w:val="nil"/>
+                <w:between w:val="nil"/>
+              </w:pBdr>
+              <w:spacing w:line="240" w:lineRule="auto"/>
+            </w:pPr>
+            <w:r>
+              <w:lastRenderedPageBreak/>
+              <w:t>Chrome Browser</w:t>
+            </w:r>
+          </w:p>
+        </w:tc>
+        <w:tc>
+          <w:tcPr>
+            <w:tcW w:w="825" w:type="dxa"/>
+            <w:shd w:val="clear" w:color="auto" w:fill="auto"/>
+            <w:tcMar>
+              <w:top w:w="100" w:type="dxa"/>
+              <w:left w:w="100" w:type="dxa"/>
+              <w:bottom w:w="100" w:type="dxa"/>
+              <w:right w:w="100" w:type="dxa"/>
+            </w:tcMar>
+          </w:tcPr>
+          <w:p>
+            <w:pPr>
+              <w:widowControl w:val="0"/>
+              <w:pBdr>
+                <w:top w:val="nil"/>
+                <w:left w:val="nil"/>
+                <w:bottom w:val="nil"/>
+                <w:right w:val="nil"/>
+                <w:between w:val="nil"/>
+              </w:pBdr>
+              <w:spacing w:line="240" w:lineRule="auto"/>
+            </w:pPr>
+            <w:r>
+              <w:t>TC01</w:t>
+            </w:r>
+          </w:p>
+        </w:tc>
+        <w:tc>
+          <w:tcPr>
+            <w:tcW w:w="1320" w:type="dxa"/>
+            <w:shd w:val="clear" w:color="auto" w:fill="auto"/>
+            <w:tcMar>
+              <w:top w:w="100" w:type="dxa"/>
+              <w:left w:w="100" w:type="dxa"/>
+              <w:bottom w:w="100" w:type="dxa"/>
+              <w:right w:w="100" w:type="dxa"/>
+            </w:tcMar>
+          </w:tcPr>
+          <w:p>
+            <w:pPr>
+              <w:widowControl w:val="0"/>
+              <w:pBdr>
+                <w:top w:val="nil"/>
+                <w:left w:val="nil"/>
+                <w:bottom w:val="nil"/>
+                <w:right w:val="nil"/>
+                <w:between w:val="nil"/>
+              </w:pBdr>
+              <w:spacing w:line="240" w:lineRule="auto"/>
+            </w:pPr>
+            <w:r>
+              <w:t>PASS</w:t>
+            </w:r>
+          </w:p>
+        </w:tc>
+      </w:tr>
+      <w:tr>
+        <w:tc>
+          <w:tcPr>
+            <w:tcW w:w="1125" w:type="dxa"/>
+            <w:shd w:val="clear" w:color="auto" w:fill="auto"/>
+            <w:tcMar>
+              <w:top w:w="100" w:type="dxa"/>
+              <w:left w:w="100" w:type="dxa"/>
+              <w:bottom w:w="100" w:type="dxa"/>
+              <w:right w:w="100" w:type="dxa"/>
+            </w:tcMar>
+          </w:tcPr>
+          <w:p>
+            <w:pPr>
+              <w:widowControl w:val="0"/>
+              <w:spacing w:line="240" w:lineRule="auto"/>
+            </w:pPr>
+            <w:r>
+              <w:lastRenderedPageBreak/>
+              <w:t>TC09</w:t>
+            </w:r>
+          </w:p>
+        </w:tc>
+        <w:tc>
+          <w:tcPr>
+            <w:tcW w:w="1620" w:type="dxa"/>
+            <w:shd w:val="clear" w:color="auto" w:fill="auto"/>
+            <w:tcMar>
+              <w:top w:w="100" w:type="dxa"/>
+              <w:left w:w="100" w:type="dxa"/>
+              <w:bottom w:w="100" w:type="dxa"/>
+              <w:right w:w="100" w:type="dxa"/>
+            </w:tcMar>
+          </w:tcPr>
+          <w:p>
+            <w:pPr>
+              <w:keepLines/>
+              <w:spacing w:line="240" w:lineRule="auto"/>
+            </w:pPr>
+            <w:r>
+              <w:t>Testing whether the site enforces HTTPS network protocol over HTTP</w:t>
+            </w:r>
+          </w:p>
+        </w:tc>
+        <w:tc>
+          <w:tcPr>
+            <w:tcW w:w="1755" w:type="dxa"/>
+            <w:shd w:val="clear" w:color="auto" w:fill="auto"/>
+            <w:tcMar>
+              <w:top w:w="100" w:type="dxa"/>
+              <w:left w:w="100" w:type="dxa"/>
+              <w:bottom w:w="100" w:type="dxa"/>
+              <w:right w:w="100" w:type="dxa"/>
+            </w:tcMar>
+          </w:tcPr>
+          <w:p>
+            <w:pPr>
+              <w:widowControl w:val="0"/>
+              <w:pBdr>
+                <w:top w:val="nil"/>
+                <w:left w:val="nil"/>
+                <w:bottom w:val="nil"/>
+                <w:right w:val="nil"/>
+                <w:between w:val="nil"/>
+              </w:pBdr>
+              <w:spacing w:line="240" w:lineRule="auto"/>
+            </w:pPr>
+            <w:r>
+              <w:t>none</w:t>
+            </w:r>
+          </w:p>
+        </w:tc>
+        <w:tc>
+          <w:tcPr>
+            <w:tcW w:w="1770" w:type="dxa"/>
+            <w:shd w:val="clear" w:color="auto" w:fill="auto"/>
+            <w:tcMar>
+              <w:top w:w="100" w:type="dxa"/>
+              <w:left w:w="100" w:type="dxa"/>
+              <w:bottom w:w="100" w:type="dxa"/>
+              <w:right w:w="100" w:type="dxa"/>
+            </w:tcMar>
+          </w:tcPr>
+          <w:p>
+            <w:pPr>
+              <w:widowControl w:val="0"/>
+              <w:spacing w:before="240" w:after="240" w:line="240" w:lineRule="auto"/>
+            </w:pPr>
+            <w:r>
+              <w:t>Apple’s Homepage</w:t>
+            </w:r>
+          </w:p>
+        </w:tc>
+        <w:tc>
+          <w:tcPr>
+            <w:tcW w:w="825" w:type="dxa"/>
+            <w:shd w:val="clear" w:color="auto" w:fill="auto"/>
+            <w:tcMar>
+              <w:top w:w="100" w:type="dxa"/>
+              <w:left w:w="100" w:type="dxa"/>
+              <w:bottom w:w="100" w:type="dxa"/>
+              <w:right w:w="100" w:type="dxa"/>
+            </w:tcMar>
+          </w:tcPr>
+          <w:p>
+            <w:pPr>
+              <w:widowControl w:val="0"/>
+              <w:pBdr>
+                <w:top w:val="nil"/>
+                <w:left w:val="nil"/>
+                <w:bottom w:val="nil"/>
+                <w:right w:val="nil"/>
+                <w:between w:val="nil"/>
+              </w:pBdr>
+              <w:spacing w:line="240" w:lineRule="auto"/>
+            </w:pPr>
+            <w:r>
+              <w:t>Chrome Browser</w:t>
+            </w:r>
+          </w:p>
+        </w:tc>
+        <w:tc>
+          <w:tcPr>
+            <w:tcW w:w="825" w:type="dxa"/>
+            <w:shd w:val="clear" w:color="auto" w:fill="auto"/>
+            <w:tcMar>
+              <w:top w:w="100" w:type="dxa"/>
+              <w:left w:w="100" w:type="dxa"/>
+              <w:bottom w:w="100" w:type="dxa"/>
+              <w:right w:w="100" w:type="dxa"/>
+            </w:tcMar>
+          </w:tcPr>
+          <w:p>
+            <w:pPr>
+              <w:widowControl w:val="0"/>
+              <w:pBdr>
+                <w:top w:val="nil"/>
+                <w:left w:val="nil"/>
+                <w:bottom w:val="nil"/>
+                <w:right w:val="nil"/>
+                <w:between w:val="nil"/>
+              </w:pBdr>
+              <w:spacing w:line="240" w:lineRule="auto"/>
+            </w:pPr>
+            <w:r>
+              <w:t>TC01</w:t>
+            </w:r>
+          </w:p>
+        </w:tc>
+        <w:tc>
+          <w:tcPr>
+            <w:tcW w:w="1320" w:type="dxa"/>
+            <w:shd w:val="clear" w:color="auto" w:fill="auto"/>
+            <w:tcMar>
+              <w:top w:w="100" w:type="dxa"/>
+              <w:left w:w="100" w:type="dxa"/>
+              <w:bottom w:w="100" w:type="dxa"/>
+              <w:right w:w="100" w:type="dxa"/>
+            </w:tcMar>
+          </w:tcPr>
+          <w:p>
+            <w:pPr>
+              <w:widowControl w:val="0"/>
+              <w:pBdr>
+                <w:top w:val="nil"/>
+                <w:left w:val="nil"/>
+                <w:bottom w:val="nil"/>
+                <w:right w:val="nil"/>
+                <w:between w:val="nil"/>
+              </w:pBdr>
+              <w:spacing w:line="240" w:lineRule="auto"/>
+            </w:pPr>
+            <w:r>
+              <w:t>PASS</w:t>
+            </w:r>
+          </w:p>
+        </w:tc>
+      </w:tr>
     </w:tbl>
     <w:p>
       <w:pPr>
@@ -5537,16 +6026,7 @@
           <w:sz w:val="46"/>
           <w:szCs w:val="46"/>
         </w:rPr>
-        <w:t>5. System Test Repo</w:t>
-      </w:r>
-      <w:r>
-        <w:rPr>
-          <w:b/>
-          <w:bCs/>
-          <w:sz w:val="46"/>
-          <w:szCs w:val="46"/>
-        </w:rPr>
-        <w:t>rt Details</w:t>
+        <w:t>5. System Test Report Details</w:t>
       </w:r>
     </w:p>
     <w:p>
@@ -5794,7 +6274,6 @@
               <w:spacing w:line="240" w:lineRule="auto"/>
             </w:pPr>
             <w:r>
-              <w:lastRenderedPageBreak/>
               <w:t>TC02</w:t>
             </w:r>
           </w:p>
@@ -6252,6 +6731,167 @@
           </w:p>
         </w:tc>
       </w:tr>
+      <w:tr>
+        <w:tc>
+          <w:tcPr>
+            <w:tcW w:w="3120" w:type="dxa"/>
+            <w:tcBorders>
+              <w:top w:val="single" w:sz="8" w:space="0" w:color="000000"/>
+              <w:left w:val="single" w:sz="8" w:space="0" w:color="000000"/>
+              <w:bottom w:val="single" w:sz="8" w:space="0" w:color="000000"/>
+              <w:right w:val="single" w:sz="8" w:space="0" w:color="000000"/>
+            </w:tcBorders>
+            <w:tcMar>
+              <w:top w:w="100" w:type="dxa"/>
+              <w:left w:w="100" w:type="dxa"/>
+              <w:bottom w:w="100" w:type="dxa"/>
+              <w:right w:w="100" w:type="dxa"/>
+            </w:tcMar>
+          </w:tcPr>
+          <w:p>
+            <w:pPr>
+              <w:keepLines/>
+              <w:spacing w:line="240" w:lineRule="auto"/>
+            </w:pPr>
+            <w:r>
+              <w:lastRenderedPageBreak/>
+              <w:t>TC08</w:t>
+            </w:r>
+          </w:p>
+        </w:tc>
+        <w:tc>
+          <w:tcPr>
+            <w:tcW w:w="3120" w:type="dxa"/>
+            <w:tcBorders>
+              <w:top w:val="single" w:sz="8" w:space="0" w:color="000000"/>
+              <w:left w:val="single" w:sz="8" w:space="0" w:color="000000"/>
+              <w:bottom w:val="single" w:sz="8" w:space="0" w:color="000000"/>
+              <w:right w:val="single" w:sz="8" w:space="0" w:color="000000"/>
+            </w:tcBorders>
+            <w:tcMar>
+              <w:top w:w="100" w:type="dxa"/>
+              <w:left w:w="100" w:type="dxa"/>
+              <w:bottom w:w="100" w:type="dxa"/>
+              <w:right w:w="100" w:type="dxa"/>
+            </w:tcMar>
+          </w:tcPr>
+          <w:p>
+            <w:pPr>
+              <w:keepLines/>
+              <w:spacing w:line="240" w:lineRule="auto"/>
+            </w:pPr>
+            <w:r>
+              <w:t>Apple’s sitemap rendering</w:t>
+            </w:r>
+          </w:p>
+        </w:tc>
+        <w:tc>
+          <w:tcPr>
+            <w:tcW w:w="3120" w:type="dxa"/>
+            <w:tcBorders>
+              <w:top w:val="single" w:sz="8" w:space="0" w:color="000000"/>
+              <w:left w:val="single" w:sz="8" w:space="0" w:color="000000"/>
+              <w:bottom w:val="single" w:sz="8" w:space="0" w:color="000000"/>
+              <w:right w:val="single" w:sz="8" w:space="0" w:color="000000"/>
+            </w:tcBorders>
+            <w:tcMar>
+              <w:top w:w="100" w:type="dxa"/>
+              <w:left w:w="100" w:type="dxa"/>
+              <w:bottom w:w="100" w:type="dxa"/>
+              <w:right w:w="100" w:type="dxa"/>
+            </w:tcMar>
+          </w:tcPr>
+          <w:p>
+            <w:pPr>
+              <w:keepLines/>
+              <w:spacing w:line="240" w:lineRule="auto"/>
+            </w:pPr>
+            <w:r>
+              <w:t>PASS</w:t>
+            </w:r>
+          </w:p>
+        </w:tc>
+      </w:tr>
+      <w:tr>
+        <w:tc>
+          <w:tcPr>
+            <w:tcW w:w="3120" w:type="dxa"/>
+            <w:tcBorders>
+              <w:top w:val="single" w:sz="8" w:space="0" w:color="000000"/>
+              <w:left w:val="single" w:sz="8" w:space="0" w:color="000000"/>
+              <w:bottom w:val="single" w:sz="8" w:space="0" w:color="000000"/>
+              <w:right w:val="single" w:sz="8" w:space="0" w:color="000000"/>
+            </w:tcBorders>
+            <w:tcMar>
+              <w:top w:w="100" w:type="dxa"/>
+              <w:left w:w="100" w:type="dxa"/>
+              <w:bottom w:w="100" w:type="dxa"/>
+              <w:right w:w="100" w:type="dxa"/>
+            </w:tcMar>
+          </w:tcPr>
+          <w:p>
+            <w:pPr>
+              <w:keepLines/>
+              <w:spacing w:line="240" w:lineRule="auto"/>
+            </w:pPr>
+            <w:r>
+              <w:t>TC09</w:t>
+            </w:r>
+          </w:p>
+        </w:tc>
+        <w:tc>
+          <w:tcPr>
+            <w:tcW w:w="3120" w:type="dxa"/>
+            <w:tcBorders>
+              <w:top w:val="single" w:sz="8" w:space="0" w:color="000000"/>
+              <w:left w:val="single" w:sz="8" w:space="0" w:color="000000"/>
+              <w:bottom w:val="single" w:sz="8" w:space="0" w:color="000000"/>
+              <w:right w:val="single" w:sz="8" w:space="0" w:color="000000"/>
+            </w:tcBorders>
+            <w:tcMar>
+              <w:top w:w="100" w:type="dxa"/>
+              <w:left w:w="100" w:type="dxa"/>
+              <w:bottom w:w="100" w:type="dxa"/>
+              <w:right w:w="100" w:type="dxa"/>
+            </w:tcMar>
+          </w:tcPr>
+          <w:p>
+            <w:pPr>
+              <w:keepLines/>
+              <w:spacing w:line="240" w:lineRule="auto"/>
+            </w:pPr>
+            <w:r>
+              <w:t>Testing whether the site enforces HTTPS network protocol over HTTP</w:t>
+            </w:r>
+          </w:p>
+        </w:tc>
+        <w:tc>
+          <w:tcPr>
+            <w:tcW w:w="3120" w:type="dxa"/>
+            <w:tcBorders>
+              <w:top w:val="single" w:sz="8" w:space="0" w:color="000000"/>
+              <w:left w:val="single" w:sz="8" w:space="0" w:color="000000"/>
+              <w:bottom w:val="single" w:sz="8" w:space="0" w:color="000000"/>
+              <w:right w:val="single" w:sz="8" w:space="0" w:color="000000"/>
+            </w:tcBorders>
+            <w:tcMar>
+              <w:top w:w="100" w:type="dxa"/>
+              <w:left w:w="100" w:type="dxa"/>
+              <w:bottom w:w="100" w:type="dxa"/>
+              <w:right w:w="100" w:type="dxa"/>
+            </w:tcMar>
+          </w:tcPr>
+          <w:p>
+            <w:pPr>
+              <w:keepLines/>
+              <w:spacing w:line="240" w:lineRule="auto"/>
+            </w:pPr>
+            <w:r>
+              <w:t>PASS</w:t>
+            </w:r>
+          </w:p>
+        </w:tc>
+      </w:tr>
     </w:tbl>
     <w:p>
       <w:pPr>
@@ -6386,6 +7026,46 @@
         <w:spacing w:line="240" w:lineRule="auto"/>
       </w:pPr>
       <w:r>
+        <w:t xml:space="preserve">Tested which network protocol the site </w:t>
+      </w:r>
+      <w:r>
+        <w:t>uses</w:t>
+      </w:r>
+    </w:p>
+    <w:p>
+      <w:pPr>
+        <w:keepLines/>
+        <w:numPr>
+          <w:ilvl w:val="0"/>
+          <w:numId w:val="18"/>
+        </w:numPr>
+        <w:spacing w:line="240" w:lineRule="auto"/>
+      </w:pPr>
+      <w:r>
+        <w:t xml:space="preserve">Tested </w:t>
+      </w:r>
+      <w:r>
+        <w:t>s</w:t>
+      </w:r>
+      <w:bookmarkStart w:id="29" w:name="_GoBack"/>
+      <w:bookmarkEnd w:id="29"/>
+      <w:r>
+        <w:t>itemap</w:t>
+      </w:r>
+      <w:r>
+        <w:t xml:space="preserve"> rendering</w:t>
+      </w:r>
+    </w:p>
+    <w:p>
+      <w:pPr>
+        <w:keepLines/>
+        <w:numPr>
+          <w:ilvl w:val="0"/>
+          <w:numId w:val="18"/>
+        </w:numPr>
+        <w:spacing w:line="240" w:lineRule="auto"/>
+      </w:pPr>
+      <w:r>
         <w:t>Performed multiple searches</w:t>
       </w:r>
     </w:p>
@@ -6425,8 +7105,8 @@
           <w:szCs w:val="34"/>
         </w:rPr>
       </w:pPr>
-      <w:bookmarkStart w:id="29" w:name="_cq5xy8wly7zs" w:colFirst="0" w:colLast="0"/>
-      <w:bookmarkEnd w:id="29"/>
+      <w:bookmarkStart w:id="30" w:name="_cq5xy8wly7zs" w:colFirst="0" w:colLast="0"/>
+      <w:bookmarkEnd w:id="30"/>
       <w:r>
         <w:rPr>
           <w:b/>
@@ -6550,8 +7230,8 @@
           <w:szCs w:val="34"/>
         </w:rPr>
       </w:pPr>
-      <w:bookmarkStart w:id="30" w:name="_mt9p87tlwvs5" w:colFirst="0" w:colLast="0"/>
-      <w:bookmarkEnd w:id="30"/>
+      <w:bookmarkStart w:id="31" w:name="_mt9p87tlwvs5" w:colFirst="0" w:colLast="0"/>
+      <w:bookmarkEnd w:id="31"/>
       <w:r>
         <w:rPr>
           <w:b/>
@@ -6568,11 +7248,8 @@
         <w:spacing w:before="240" w:after="240" w:line="240" w:lineRule="auto"/>
       </w:pPr>
       <w:r>
-        <w:lastRenderedPageBreak/>
         <w:t>The Apple website automation testing system successfully verifies important frontend functionalities.</w:t>
       </w:r>
-      <w:bookmarkStart w:id="31" w:name="_GoBack"/>
-      <w:bookmarkEnd w:id="31"/>
     </w:p>
     <w:p>
       <w:pPr>
@@ -6593,6 +7270,7 @@
         <w:spacing w:before="240" w:line="240" w:lineRule="auto"/>
       </w:pPr>
       <w:r>
+        <w:lastRenderedPageBreak/>
         <w:t>Add screenshot capture on failures.</w:t>
       </w:r>
     </w:p>
@@ -6728,7 +7406,7 @@
       <w:rPr>
         <w:noProof/>
       </w:rPr>
-      <w:t>8</w:t>
+      <w:t>12</w:t>
     </w:r>
     <w:r>
       <w:fldChar w:fldCharType="end"/>
@@ -8573,6 +9251,232 @@
     </w:lvl>
   </w:abstractNum>
   <w:abstractNum w:abstractNumId="16" w15:restartNumberingAfterBreak="0">
+    <w:nsid w:val="491A2015"/>
+    <w:multiLevelType w:val="hybridMultilevel"/>
+    <w:tmpl w:val="1E7A95D2"/>
+    <w:lvl w:ilvl="0" w:tplc="40090001">
+      <w:start w:val="1"/>
+      <w:numFmt w:val="bullet"/>
+      <w:lvlText w:val=""/>
+      <w:lvlJc w:val="left"/>
+      <w:pPr>
+        <w:ind w:left="720" w:hanging="360"/>
+      </w:pPr>
+      <w:rPr>
+        <w:rFonts w:ascii="Symbol" w:hAnsi="Symbol" w:hint="default"/>
+      </w:rPr>
+    </w:lvl>
+    <w:lvl w:ilvl="1" w:tplc="40090003" w:tentative="1">
+      <w:start w:val="1"/>
+      <w:numFmt w:val="bullet"/>
+      <w:lvlText w:val="o"/>
+      <w:lvlJc w:val="left"/>
+      <w:pPr>
+        <w:ind w:left="1440" w:hanging="360"/>
+      </w:pPr>
+      <w:rPr>
+        <w:rFonts w:ascii="Courier New" w:hAnsi="Courier New" w:cs="Courier New" w:hint="default"/>
+      </w:rPr>
+    </w:lvl>
+    <w:lvl w:ilvl="2" w:tplc="40090005" w:tentative="1">
+      <w:start w:val="1"/>
+      <w:numFmt w:val="bullet"/>
+      <w:lvlText w:val=""/>
+      <w:lvlJc w:val="left"/>
+      <w:pPr>
+        <w:ind w:left="2160" w:hanging="360"/>
+      </w:pPr>
+      <w:rPr>
+        <w:rFonts w:ascii="Wingdings" w:hAnsi="Wingdings" w:hint="default"/>
+      </w:rPr>
+    </w:lvl>
+    <w:lvl w:ilvl="3" w:tplc="40090001" w:tentative="1">
+      <w:start w:val="1"/>
+      <w:numFmt w:val="bullet"/>
+      <w:lvlText w:val=""/>
+      <w:lvlJc w:val="left"/>
+      <w:pPr>
+        <w:ind w:left="2880" w:hanging="360"/>
+      </w:pPr>
+      <w:rPr>
+        <w:rFonts w:ascii="Symbol" w:hAnsi="Symbol" w:hint="default"/>
+      </w:rPr>
+    </w:lvl>
+    <w:lvl w:ilvl="4" w:tplc="40090003" w:tentative="1">
+      <w:start w:val="1"/>
+      <w:numFmt w:val="bullet"/>
+      <w:lvlText w:val="o"/>
+      <w:lvlJc w:val="left"/>
+      <w:pPr>
+        <w:ind w:left="3600" w:hanging="360"/>
+      </w:pPr>
+      <w:rPr>
+        <w:rFonts w:ascii="Courier New" w:hAnsi="Courier New" w:cs="Courier New" w:hint="default"/>
+      </w:rPr>
+    </w:lvl>
+    <w:lvl w:ilvl="5" w:tplc="40090005" w:tentative="1">
+      <w:start w:val="1"/>
+      <w:numFmt w:val="bullet"/>
+      <w:lvlText w:val=""/>
+      <w:lvlJc w:val="left"/>
+      <w:pPr>
+        <w:ind w:left="4320" w:hanging="360"/>
+      </w:pPr>
+      <w:rPr>
+        <w:rFonts w:ascii="Wingdings" w:hAnsi="Wingdings" w:hint="default"/>
+      </w:rPr>
+    </w:lvl>
+    <w:lvl w:ilvl="6" w:tplc="40090001" w:tentative="1">
+      <w:start w:val="1"/>
+      <w:numFmt w:val="bullet"/>
+      <w:lvlText w:val=""/>
+      <w:lvlJc w:val="left"/>
+      <w:pPr>
+        <w:ind w:left="5040" w:hanging="360"/>
+      </w:pPr>
+      <w:rPr>
+        <w:rFonts w:ascii="Symbol" w:hAnsi="Symbol" w:hint="default"/>
+      </w:rPr>
+    </w:lvl>
+    <w:lvl w:ilvl="7" w:tplc="40090003" w:tentative="1">
+      <w:start w:val="1"/>
+      <w:numFmt w:val="bullet"/>
+      <w:lvlText w:val="o"/>
+      <w:lvlJc w:val="left"/>
+      <w:pPr>
+        <w:ind w:left="5760" w:hanging="360"/>
+      </w:pPr>
+      <w:rPr>
+        <w:rFonts w:ascii="Courier New" w:hAnsi="Courier New" w:cs="Courier New" w:hint="default"/>
+      </w:rPr>
+    </w:lvl>
+    <w:lvl w:ilvl="8" w:tplc="40090005" w:tentative="1">
+      <w:start w:val="1"/>
+      <w:numFmt w:val="bullet"/>
+      <w:lvlText w:val=""/>
+      <w:lvlJc w:val="left"/>
+      <w:pPr>
+        <w:ind w:left="6480" w:hanging="360"/>
+      </w:pPr>
+      <w:rPr>
+        <w:rFonts w:ascii="Wingdings" w:hAnsi="Wingdings" w:hint="default"/>
+      </w:rPr>
+    </w:lvl>
+  </w:abstractNum>
+  <w:abstractNum w:abstractNumId="17" w15:restartNumberingAfterBreak="0">
+    <w:nsid w:val="4AA7211C"/>
+    <w:multiLevelType w:val="multilevel"/>
+    <w:tmpl w:val="6D34E30E"/>
+    <w:lvl w:ilvl="0">
+      <w:start w:val="1"/>
+      <w:numFmt w:val="decimal"/>
+      <w:lvlText w:val="%1."/>
+      <w:lvlJc w:val="left"/>
+      <w:pPr>
+        <w:ind w:left="720" w:hanging="360"/>
+      </w:pPr>
+      <w:rPr>
+        <w:u w:val="none"/>
+      </w:rPr>
+    </w:lvl>
+    <w:lvl w:ilvl="1">
+      <w:start w:val="1"/>
+      <w:numFmt w:val="lowerLetter"/>
+      <w:lvlText w:val="%2."/>
+      <w:lvlJc w:val="left"/>
+      <w:pPr>
+        <w:ind w:left="1440" w:hanging="360"/>
+      </w:pPr>
+      <w:rPr>
+        <w:u w:val="none"/>
+      </w:rPr>
+    </w:lvl>
+    <w:lvl w:ilvl="2">
+      <w:start w:val="1"/>
+      <w:numFmt w:val="lowerRoman"/>
+      <w:lvlText w:val="%3."/>
+      <w:lvlJc w:val="left"/>
+      <w:pPr>
+        <w:ind w:left="2160" w:hanging="360"/>
+      </w:pPr>
+      <w:rPr>
+        <w:u w:val="none"/>
+      </w:rPr>
+    </w:lvl>
+    <w:lvl w:ilvl="3">
+      <w:start w:val="1"/>
+      <w:numFmt w:val="decimal"/>
+      <w:lvlText w:val="%4."/>
+      <w:lvlJc w:val="left"/>
+      <w:pPr>
+        <w:ind w:left="2880" w:hanging="360"/>
+      </w:pPr>
+      <w:rPr>
+        <w:u w:val="none"/>
+      </w:rPr>
+    </w:lvl>
+    <w:lvl w:ilvl="4">
+      <w:start w:val="1"/>
+      <w:numFmt w:val="lowerLetter"/>
+      <w:lvlText w:val="%5."/>
+      <w:lvlJc w:val="left"/>
+      <w:pPr>
+        <w:ind w:left="3600" w:hanging="360"/>
+      </w:pPr>
+      <w:rPr>
+        <w:u w:val="none"/>
+      </w:rPr>
+    </w:lvl>
+    <w:lvl w:ilvl="5">
+      <w:start w:val="1"/>
+      <w:numFmt w:val="lowerRoman"/>
+      <w:lvlText w:val="%6."/>
+      <w:lvlJc w:val="left"/>
+      <w:pPr>
+        <w:ind w:left="4320" w:hanging="360"/>
+      </w:pPr>
+      <w:rPr>
+        <w:u w:val="none"/>
+      </w:rPr>
+    </w:lvl>
+    <w:lvl w:ilvl="6">
+      <w:start w:val="1"/>
+      <w:numFmt w:val="decimal"/>
+      <w:lvlText w:val="%7."/>
+      <w:lvlJc w:val="left"/>
+      <w:pPr>
+        <w:ind w:left="5040" w:hanging="360"/>
+      </w:pPr>
+      <w:rPr>
+        <w:u w:val="none"/>
+      </w:rPr>
+    </w:lvl>
+    <w:lvl w:ilvl="7">
+      <w:start w:val="1"/>
+      <w:numFmt w:val="lowerLetter"/>
+      <w:lvlText w:val="%8."/>
+      <w:lvlJc w:val="left"/>
+      <w:pPr>
+        <w:ind w:left="5760" w:hanging="360"/>
+      </w:pPr>
+      <w:rPr>
+        <w:u w:val="none"/>
+      </w:rPr>
+    </w:lvl>
+    <w:lvl w:ilvl="8">
+      <w:start w:val="1"/>
+      <w:numFmt w:val="lowerRoman"/>
+      <w:lvlText w:val="%9."/>
+      <w:lvlJc w:val="left"/>
+      <w:pPr>
+        <w:ind w:left="6480" w:hanging="360"/>
+      </w:pPr>
+      <w:rPr>
+        <w:u w:val="none"/>
+      </w:rPr>
+    </w:lvl>
+  </w:abstractNum>
+  <w:abstractNum w:abstractNumId="18" w15:restartNumberingAfterBreak="0">
     <w:nsid w:val="4F472CBA"/>
     <w:multiLevelType w:val="multilevel"/>
     <w:tmpl w:val="1B9CAC12"/>
@@ -8685,7 +9589,7 @@
       </w:rPr>
     </w:lvl>
   </w:abstractNum>
-  <w:abstractNum w:abstractNumId="17" w15:restartNumberingAfterBreak="0">
+  <w:abstractNum w:abstractNumId="19" w15:restartNumberingAfterBreak="0">
     <w:nsid w:val="4F582616"/>
     <w:multiLevelType w:val="multilevel"/>
     <w:tmpl w:val="CBC28E56"/>
@@ -8798,7 +9702,7 @@
       </w:rPr>
     </w:lvl>
   </w:abstractNum>
-  <w:abstractNum w:abstractNumId="18" w15:restartNumberingAfterBreak="0">
+  <w:abstractNum w:abstractNumId="20" w15:restartNumberingAfterBreak="0">
     <w:nsid w:val="53DA20F7"/>
     <w:multiLevelType w:val="multilevel"/>
     <w:tmpl w:val="B492FD5A"/>
@@ -8911,7 +9815,7 @@
       </w:rPr>
     </w:lvl>
   </w:abstractNum>
-  <w:abstractNum w:abstractNumId="19" w15:restartNumberingAfterBreak="0">
+  <w:abstractNum w:abstractNumId="21" w15:restartNumberingAfterBreak="0">
     <w:nsid w:val="5DE96E89"/>
     <w:multiLevelType w:val="multilevel"/>
     <w:tmpl w:val="9EAA7B4E"/>
@@ -9024,7 +9928,7 @@
       </w:rPr>
     </w:lvl>
   </w:abstractNum>
-  <w:abstractNum w:abstractNumId="20" w15:restartNumberingAfterBreak="0">
+  <w:abstractNum w:abstractNumId="22" w15:restartNumberingAfterBreak="0">
     <w:nsid w:val="690B1D64"/>
     <w:multiLevelType w:val="multilevel"/>
     <w:tmpl w:val="92288226"/>
@@ -9137,7 +10041,7 @@
       </w:rPr>
     </w:lvl>
   </w:abstractNum>
-  <w:abstractNum w:abstractNumId="21" w15:restartNumberingAfterBreak="0">
+  <w:abstractNum w:abstractNumId="23" w15:restartNumberingAfterBreak="0">
     <w:nsid w:val="772774E7"/>
     <w:multiLevelType w:val="multilevel"/>
     <w:tmpl w:val="0C1C07BC"/>
@@ -9251,13 +10155,13 @@
     </w:lvl>
   </w:abstractNum>
   <w:num w:numId="1">
-    <w:abstractNumId w:val="20"/>
+    <w:abstractNumId w:val="22"/>
   </w:num>
   <w:num w:numId="2">
     <w:abstractNumId w:val="9"/>
   </w:num>
   <w:num w:numId="3">
-    <w:abstractNumId w:val="19"/>
+    <w:abstractNumId w:val="21"/>
   </w:num>
   <w:num w:numId="4">
     <w:abstractNumId w:val="0"/>
@@ -9266,7 +10170,7 @@
     <w:abstractNumId w:val="12"/>
   </w:num>
   <w:num w:numId="6">
-    <w:abstractNumId w:val="17"/>
+    <w:abstractNumId w:val="19"/>
   </w:num>
   <w:num w:numId="7">
     <w:abstractNumId w:val="2"/>
@@ -9293,13 +10197,13 @@
     <w:abstractNumId w:val="14"/>
   </w:num>
   <w:num w:numId="15">
-    <w:abstractNumId w:val="16"/>
+    <w:abstractNumId w:val="18"/>
   </w:num>
   <w:num w:numId="16">
-    <w:abstractNumId w:val="18"/>
+    <w:abstractNumId w:val="20"/>
   </w:num>
   <w:num w:numId="17">
-    <w:abstractNumId w:val="21"/>
+    <w:abstractNumId w:val="23"/>
   </w:num>
   <w:num w:numId="18">
     <w:abstractNumId w:val="3"/>
@@ -9315,6 +10219,12 @@
   </w:num>
   <w:num w:numId="22">
     <w:abstractNumId w:val="7"/>
+  </w:num>
+  <w:num w:numId="23">
+    <w:abstractNumId w:val="17"/>
+  </w:num>
+  <w:num w:numId="24">
+    <w:abstractNumId w:val="16"/>
   </w:num>
 </w:numbering>
 </file>
@@ -9711,6 +10621,7 @@
   </w:latentStyles>
   <w:style w:type="paragraph" w:default="1" w:styleId="Normal">
     <w:name w:val="Normal"/>
+    <w:rsid w:val="003344AF"/>
   </w:style>
   <w:style w:type="paragraph" w:styleId="Heading1">
     <w:name w:val="heading 1"/>
@@ -9891,6 +10802,17 @@
       <w:tblStyleRowBandSize w:val="1"/>
       <w:tblStyleColBandSize w:val="1"/>
     </w:tblPr>
+  </w:style>
+  <w:style w:type="paragraph" w:styleId="ListParagraph">
+    <w:name w:val="List Paragraph"/>
+    <w:basedOn w:val="Normal"/>
+    <w:uiPriority w:val="34"/>
+    <w:qFormat/>
+    <w:rsid w:val="00311556"/>
+    <w:pPr>
+      <w:ind w:left="720"/>
+      <w:contextualSpacing/>
+    </w:pPr>
   </w:style>
 </w:styles>
 </file>

</xml_diff>